<commit_message>
Draw Fig 4, the ROC curves, from validated rather than apparent probabilities
稿件的 Fig 4 不能画表观概率。表观宏平均 AUC 0.826，折内交叉验证 0.792，
差 0.034；若图画表观而 Table 3 报交叉验证，图与表在同一篇稿子里就对不上，
而且解释不掉——曲线下面积是能从图上量出来的。

definitive_analysis.py 原先只把表观概率画成 roc.png，没有留下交叉验证与
时间验证的逐例概率，作图时无从取用。故：

- 新增 save_predictions()，把三套概率写入 outputs/predictions.csv，
  用 set 列区分 apparent / cv / temporal，取哪一套必须在代码里写明
- build_figure4.py 只读 cv 与 temporal 两套
- 表观曲线改存 roc_apparent_DIAGNOSTIC.png，文件名与图内标题都标
  「不可入稿」，留作诊断；删掉易被误用的旧 roc.png

Fig 4 为两栏：A 内部验证（折内插补的 5 折交叉验证，N=1238，宏平均 0.792），
B 时间外部验证（2016–2023 拟合的模型原样用于 2023 年后，N=413，宏平均 0.772）。
AUC 附 95% 自助置信区间（2000 次重抽病例），类别例数写在括号里——时间验证集
手术仅 32 例，读者看到 n 才知道那条 0.96 的区间为什么宽。

顺带修正正文图号：正文把校准曲线写作 Fig 4、DCA 写作 Fig 5，而图目录里
Fig 4 是 ROC、Fig 5 是「校准 + DCA」合幅，已按图目录改为 Fig 5A / Fig 5B。

同步更新 CLAUDE.md、docs/SCI论文写作方案.md §七与 README。

Co-Authored-By: Claude Opus 5 <noreply@anthropic.com>
Claude-Session: https://claude.ai/code/session_01M5hRCP6MP6tYhN6dTe147T
</commit_message>
<xml_diff>
--- a/manuscript/Manuscript_draft.docx
+++ b/manuscript/Manuscript_draft.docx
@@ -669,7 +669,7 @@
           <w:i w:val="0"/>
           <w:sz w:val="24"/>
         </w:rPr>
-        <w:t>【TODO: 全部效能结果。当前预试验值（5 折交叉验证、中位数填补、未做重标注）为：多分类 Logistic 宏平均 AUC 0.788（观察 0.725、内镜 0.735、手术 0.904）；随机森林宏平均 0.796；时间验证手术 AUC 0.945、宏平均 0.773。这些数字仅供占位，正式分析后整段重写】</w:t>
+        <w:t>【TODO: 全部效能结果。当前预试验值（5 折交叉验证、中位数填补、未做重标注）为：多分类 Logistic 宏平均 AUC 0.788（观察 0.725、内镜 0.735、手术 0.904）；随机森林宏平均 0.796；时间验证手术 AUC 0.945、宏平均 0.773。这些数字仅供占位，正式分析后整段重写。改写时须引 Fig 4，并以折内交叉验证值为内部效能的主报告值——表观 0.826 与 Bootstrap 校正 0.807 均偏乐观，不可单报】</w:t>
       </w:r>
     </w:p>
     <w:p>
@@ -682,7 +682,7 @@
           <w:i w:val="0"/>
           <w:sz w:val="24"/>
         </w:rPr>
-        <w:t>【TODO: 校准结果——逐类校准斜率与截距、校准曲线（Fig 4）】</w:t>
+        <w:t>【TODO: 校准结果——逐类校准斜率与截距、校准曲线（Fig 5A）】</w:t>
       </w:r>
     </w:p>
     <w:p>
@@ -695,7 +695,7 @@
           <w:i w:val="0"/>
           <w:sz w:val="24"/>
         </w:rPr>
-        <w:t>【TODO: 决策曲线分析结果——各类别在临床相关阈值区间的净获益（Fig 5）】</w:t>
+        <w:t>【TODO: 决策曲线分析结果——各类别在临床相关阈值区间的净获益（Fig 5B）】</w:t>
       </w:r>
     </w:p>
     <w:p>
@@ -1106,7 +1106,7 @@
           <w:i w:val="0"/>
           <w:sz w:val="24"/>
         </w:rPr>
-        <w:t>Fig 4. Receiver operating characteristic curves, one-versus-rest, development and temporal validation. 【TODO】</w:t>
+        <w:t>Fig 4. Receiver operating characteristic curves, one-versus-rest. (A) Internal validation by 5-fold cross-validation with imputation performed separately within each fold (N = 1238). (B) Temporal validation: the model fitted on 2016–2023 admissions applied unchanged to admissions after 2023 (N = 413). Areas under the curve are shown with 95% bootstrap confidence intervals from 2000 resamples of cases; class sizes are in parentheses. Apparent (in-sample) curves are not shown because they overstate discrimination by about 0.03 macro AUC. (已生成：outputs/figures/fig4_roc.pdf，矢量)</w:t>
       </w:r>
     </w:p>
     <w:p>

</xml_diff>

<commit_message>
Record that the magnet paper is submitted and ethics is filed
用户确认（2026-09）：磁性异物论文已投 JPGN 在审，伦理已提交。两件事都改变了
后续该怎么做，故不只是改状态标签。

## 披露窗口已关闭

此前 CLAUDE.md 与 docs §五写的「零披露负担的干净投稿」已经用掉。本文投出时：
投稿系统「是否有相关稿件他处在审」须答「是」并注明 JPGN；投稿信主动披露；
Methods 引用该文（未见刊前按 under review 或 medRxiv DOI）。旧说法已全部改写，
并在 docs §五加了显眼提示，免得日后照旧版执行。

## JPGN 由「避免撞车」升级为「完全排除」

该刊此刻正握着同一队列的另一篇稿子，这不再是偏好问题。只有在该文已见刊
（不是仍在审）且 J Pediatr Surg 及后续顺位均未中时，才可重新考虑。

## 该文已定稿，正是对表时机

写进记忆的两件待办：数字口径对齐（以该文投出版本为准回改脚本，含分母口径
1238 住院次数 vs 1228 患儿）、Fig 2 与 Table 4 的重复图表核对。该文每次修回后
都要重新对表——修回常改纳入标准与分母。

## 正文 §2.8 里一句未经核实的断言

原文写「no figure, table or result is shared between the two reports」。这句在
重复图表核对完成前并未证实，而它一旦不成立就是重复发表问题。已加 TODO 标出，
并改写该节说明两文问题之别（该文描述吞了什么、磁体多久穿孔；本文预测三种处置
中会落到哪一种）。REF-10 一并注明须向用户索取题目、作者序与投稿日期。

伦理记为已提交；批件号与批准日期仍是 Methods 与投稿系统的必填项，TODO 保留。

Co-Authored-By: Claude Opus 5 <noreply@anthropic.com>
Claude-Session: https://claude.ai/code/session_01M5hRCP6MP6tYhN6dTe147T
</commit_message>
<xml_diff>
--- a/manuscript/Manuscript_draft.docx
+++ b/manuscript/Manuscript_draft.docx
@@ -578,7 +578,7 @@
           <w:i w:val="0"/>
           <w:sz w:val="24"/>
         </w:rPr>
-        <w:t>2.8. Relation to a previous report</w:t>
+        <w:t>2.8. Relation to a companion report</w:t>
       </w:r>
     </w:p>
     <w:p>
@@ -591,7 +591,7 @@
           <w:i w:val="0"/>
           <w:sz w:val="24"/>
         </w:rPr>
-        <w:t>This cohort has been partly described in a separate report concerning the epidemiology of magnetic foreign body ingestion [REF-10: 作者本人的磁性异物论文，见刊后补入完整引用；投稿时若仍在审，按期刊要求随稿提供]. The present study addresses a different question, with a different outcome variable and analytical approach, and no figure, table or result is shared between the two reports.</w:t>
+        <w:t>This cohort has been partly described in a separate report on the epidemiology of magnetic foreign body ingestion, by the same authors and currently under review [REF-10: 作者本人的磁性异物论文，已投 JPGN 在审。须向用户索取题目、作者序与投稿日期；见刊或挂出 medRxiv 预印本后补入完整引用，在此之前按 「under review」 处理]. The present study addresses a different question, with a different outcome variable and a different analytical approach: that report describes what children swallow and how often magnets perforate, whereas this one predicts which of three management decisions a child will receive. 【TODO: 逐一核对后确认「两文不共用任何图表与结果」这一句成立——Fig 2 与 Table 4 是风险点。该文已定稿投出，图表清单固定，现在即可核；核完前不要把这句当已证实的事实投出去】</w:t>
       </w:r>
     </w:p>
     <w:p>

</xml_diff>